<commit_message>
Name Dr. Sumit Kumar as Head of Department in BDA submissions.
Co-authored-by: dhingrasukhada <dhingrasukhada@gmail.com>
</commit_message>
<xml_diff>
--- a/BDA_Project_Report_2026_2027.docx
+++ b/BDA_Project_Report_2026_2027.docx
@@ -1672,7 +1672,9 @@
               <w:spacing w:before="20" w:after="20"/>
               <w:jc w:val="center"/>
             </w:pPr>
-            <w:r/>
+            <w:r>
+              <w:t>Dr. Sumit Kumar</w:t>
+            </w:r>
             <w:r>
               <w:rPr>
                 <w:rFonts w:ascii="Times New Roman" w:hAnsi="Times New Roman" w:cs="Times New Roman" w:eastAsia="Times New Roman"/>

</xml_diff>